<commit_message>
Optimized solution using sliding window for challenge 3
</commit_message>
<xml_diff>
--- a/Output/Outputs.docx
+++ b/Output/Outputs.docx
@@ -45,6 +45,43 @@
       <w:pPr>
         <w:pStyle w:val="ListParagraph"/>
       </w:pPr>
+      <w:r>
+        <w:drawing>
+          <wp:inline distT="0" distB="0" distL="0" distR="0" wp14:anchorId="4A0B695B" wp14:editId="0726F109">
+            <wp:extent cx="5943600" cy="1040130"/>
+            <wp:effectExtent l="0" t="0" r="0" b="7620"/>
+            <wp:docPr id="1386363277" name="Picture 1"/>
+            <wp:cNvGraphicFramePr>
+              <a:graphicFrameLocks xmlns:a="http://schemas.openxmlformats.org/drawingml/2006/main" noChangeAspect="1"/>
+            </wp:cNvGraphicFramePr>
+            <a:graphic xmlns:a="http://schemas.openxmlformats.org/drawingml/2006/main">
+              <a:graphicData uri="http://schemas.openxmlformats.org/drawingml/2006/picture">
+                <pic:pic xmlns:pic="http://schemas.openxmlformats.org/drawingml/2006/picture">
+                  <pic:nvPicPr>
+                    <pic:cNvPr id="1386363277" name=""/>
+                    <pic:cNvPicPr/>
+                  </pic:nvPicPr>
+                  <pic:blipFill>
+                    <a:blip r:embed="rId5"/>
+                    <a:stretch>
+                      <a:fillRect/>
+                    </a:stretch>
+                  </pic:blipFill>
+                  <pic:spPr>
+                    <a:xfrm>
+                      <a:off x="0" y="0"/>
+                      <a:ext cx="5943600" cy="1040130"/>
+                    </a:xfrm>
+                    <a:prstGeom prst="rect">
+                      <a:avLst/>
+                    </a:prstGeom>
+                  </pic:spPr>
+                </pic:pic>
+              </a:graphicData>
+            </a:graphic>
+          </wp:inline>
+        </w:drawing>
+      </w:r>
     </w:p>
     <w:p>
       <w:pPr>
@@ -81,6 +118,56 @@
       </w:pPr>
       <w:r>
         <w:t>challenge3_balanced_score.py</w:t>
+      </w:r>
+    </w:p>
+    <w:p>
+      <w:pPr>
+        <w:pStyle w:val="ListParagraph"/>
+      </w:pPr>
+      <w:r>
+        <w:t>Output:</w:t>
+      </w:r>
+    </w:p>
+    <w:p>
+      <w:pPr>
+        <w:pStyle w:val="ListParagraph"/>
+      </w:pPr>
+      <w:r>
+        <w:drawing>
+          <wp:inline distT="0" distB="0" distL="0" distR="0" wp14:anchorId="28228914" wp14:editId="5CCE5EE7">
+            <wp:extent cx="5943600" cy="1274445"/>
+            <wp:effectExtent l="0" t="0" r="0" b="1905"/>
+            <wp:docPr id="384983971" name="Picture 1"/>
+            <wp:cNvGraphicFramePr>
+              <a:graphicFrameLocks xmlns:a="http://schemas.openxmlformats.org/drawingml/2006/main" noChangeAspect="1"/>
+            </wp:cNvGraphicFramePr>
+            <a:graphic xmlns:a="http://schemas.openxmlformats.org/drawingml/2006/main">
+              <a:graphicData uri="http://schemas.openxmlformats.org/drawingml/2006/picture">
+                <pic:pic xmlns:pic="http://schemas.openxmlformats.org/drawingml/2006/picture">
+                  <pic:nvPicPr>
+                    <pic:cNvPr id="384983971" name=""/>
+                    <pic:cNvPicPr/>
+                  </pic:nvPicPr>
+                  <pic:blipFill>
+                    <a:blip r:embed="rId6"/>
+                    <a:stretch>
+                      <a:fillRect/>
+                    </a:stretch>
+                  </pic:blipFill>
+                  <pic:spPr>
+                    <a:xfrm>
+                      <a:off x="0" y="0"/>
+                      <a:ext cx="5943600" cy="1274445"/>
+                    </a:xfrm>
+                    <a:prstGeom prst="rect">
+                      <a:avLst/>
+                    </a:prstGeom>
+                  </pic:spPr>
+                </pic:pic>
+              </a:graphicData>
+            </a:graphic>
+          </wp:inline>
+        </w:drawing>
       </w:r>
     </w:p>
     <w:p>

</xml_diff>

<commit_message>
Optimized solution for challenge 6
</commit_message>
<xml_diff>
--- a/Output/Outputs.docx
+++ b/Output/Outputs.docx
@@ -46,6 +46,9 @@
         <w:pStyle w:val="ListParagraph"/>
       </w:pPr>
       <w:r>
+        <w:rPr>
+          <w:noProof/>
+        </w:rPr>
         <w:drawing>
           <wp:inline distT="0" distB="0" distL="0" distR="0" wp14:anchorId="4A0B695B" wp14:editId="0726F109">
             <wp:extent cx="5943600" cy="1040130"/>
@@ -107,6 +110,43 @@
       <w:pPr>
         <w:pStyle w:val="ListParagraph"/>
       </w:pPr>
+      <w:r>
+        <w:drawing>
+          <wp:inline distT="0" distB="0" distL="0" distR="0" wp14:anchorId="287609BF" wp14:editId="63327EE6">
+            <wp:extent cx="5943600" cy="1253490"/>
+            <wp:effectExtent l="0" t="0" r="0" b="3810"/>
+            <wp:docPr id="49475361" name="Picture 1"/>
+            <wp:cNvGraphicFramePr>
+              <a:graphicFrameLocks xmlns:a="http://schemas.openxmlformats.org/drawingml/2006/main" noChangeAspect="1"/>
+            </wp:cNvGraphicFramePr>
+            <a:graphic xmlns:a="http://schemas.openxmlformats.org/drawingml/2006/main">
+              <a:graphicData uri="http://schemas.openxmlformats.org/drawingml/2006/picture">
+                <pic:pic xmlns:pic="http://schemas.openxmlformats.org/drawingml/2006/picture">
+                  <pic:nvPicPr>
+                    <pic:cNvPr id="49475361" name=""/>
+                    <pic:cNvPicPr/>
+                  </pic:nvPicPr>
+                  <pic:blipFill>
+                    <a:blip r:embed="rId6"/>
+                    <a:stretch>
+                      <a:fillRect/>
+                    </a:stretch>
+                  </pic:blipFill>
+                  <pic:spPr>
+                    <a:xfrm>
+                      <a:off x="0" y="0"/>
+                      <a:ext cx="5943600" cy="1253490"/>
+                    </a:xfrm>
+                    <a:prstGeom prst="rect">
+                      <a:avLst/>
+                    </a:prstGeom>
+                  </pic:spPr>
+                </pic:pic>
+              </a:graphicData>
+            </a:graphic>
+          </wp:inline>
+        </w:drawing>
+      </w:r>
     </w:p>
     <w:p>
       <w:pPr>
@@ -133,6 +173,9 @@
         <w:pStyle w:val="ListParagraph"/>
       </w:pPr>
       <w:r>
+        <w:rPr>
+          <w:noProof/>
+        </w:rPr>
         <w:drawing>
           <wp:inline distT="0" distB="0" distL="0" distR="0" wp14:anchorId="28228914" wp14:editId="5CCE5EE7">
             <wp:extent cx="5943600" cy="1274445"/>
@@ -149,7 +192,7 @@
                     <pic:cNvPicPr/>
                   </pic:nvPicPr>
                   <pic:blipFill>
-                    <a:blip r:embed="rId6"/>
+                    <a:blip r:embed="rId7"/>
                     <a:stretch>
                       <a:fillRect/>
                     </a:stretch>
@@ -185,13 +228,51 @@
     <w:p>
       <w:pPr>
         <w:pStyle w:val="ListParagraph"/>
-        <w:numPr>
-          <w:ilvl w:val="0"/>
-          <w:numId w:val="1"/>
-        </w:numPr>
-      </w:pPr>
-      <w:r>
-        <w:t>challenge5_fix_expression.py</w:t>
+      </w:pPr>
+      <w:r>
+        <w:t>Output:</w:t>
+      </w:r>
+    </w:p>
+    <w:p>
+      <w:pPr>
+        <w:pStyle w:val="ListParagraph"/>
+      </w:pPr>
+      <w:r>
+        <w:drawing>
+          <wp:inline distT="0" distB="0" distL="0" distR="0" wp14:anchorId="24856BEE" wp14:editId="14AB15C7">
+            <wp:extent cx="5943600" cy="1612900"/>
+            <wp:effectExtent l="0" t="0" r="0" b="6350"/>
+            <wp:docPr id="1503243616" name="Picture 1"/>
+            <wp:cNvGraphicFramePr>
+              <a:graphicFrameLocks xmlns:a="http://schemas.openxmlformats.org/drawingml/2006/main" noChangeAspect="1"/>
+            </wp:cNvGraphicFramePr>
+            <a:graphic xmlns:a="http://schemas.openxmlformats.org/drawingml/2006/main">
+              <a:graphicData uri="http://schemas.openxmlformats.org/drawingml/2006/picture">
+                <pic:pic xmlns:pic="http://schemas.openxmlformats.org/drawingml/2006/picture">
+                  <pic:nvPicPr>
+                    <pic:cNvPr id="1503243616" name=""/>
+                    <pic:cNvPicPr/>
+                  </pic:nvPicPr>
+                  <pic:blipFill>
+                    <a:blip r:embed="rId8"/>
+                    <a:stretch>
+                      <a:fillRect/>
+                    </a:stretch>
+                  </pic:blipFill>
+                  <pic:spPr>
+                    <a:xfrm>
+                      <a:off x="0" y="0"/>
+                      <a:ext cx="5943600" cy="1612900"/>
+                    </a:xfrm>
+                    <a:prstGeom prst="rect">
+                      <a:avLst/>
+                    </a:prstGeom>
+                  </pic:spPr>
+                </pic:pic>
+              </a:graphicData>
+            </a:graphic>
+          </wp:inline>
+        </w:drawing>
       </w:r>
     </w:p>
     <w:p>
@@ -203,7 +284,120 @@
         </w:numPr>
       </w:pPr>
       <w:r>
+        <w:t>challenge5_fix_expression.py</w:t>
+      </w:r>
+    </w:p>
+    <w:p>
+      <w:pPr>
+        <w:pStyle w:val="ListParagraph"/>
+      </w:pPr>
+      <w:r>
+        <w:t>Output:</w:t>
+      </w:r>
+    </w:p>
+    <w:p>
+      <w:pPr>
+        <w:pStyle w:val="ListParagraph"/>
+      </w:pPr>
+      <w:r>
+        <w:lastRenderedPageBreak/>
+        <w:drawing>
+          <wp:inline distT="0" distB="0" distL="0" distR="0" wp14:anchorId="71E36007" wp14:editId="4B30994F">
+            <wp:extent cx="5943600" cy="1837690"/>
+            <wp:effectExtent l="0" t="0" r="0" b="0"/>
+            <wp:docPr id="1402854543" name="Picture 1"/>
+            <wp:cNvGraphicFramePr>
+              <a:graphicFrameLocks xmlns:a="http://schemas.openxmlformats.org/drawingml/2006/main" noChangeAspect="1"/>
+            </wp:cNvGraphicFramePr>
+            <a:graphic xmlns:a="http://schemas.openxmlformats.org/drawingml/2006/main">
+              <a:graphicData uri="http://schemas.openxmlformats.org/drawingml/2006/picture">
+                <pic:pic xmlns:pic="http://schemas.openxmlformats.org/drawingml/2006/picture">
+                  <pic:nvPicPr>
+                    <pic:cNvPr id="1402854543" name=""/>
+                    <pic:cNvPicPr/>
+                  </pic:nvPicPr>
+                  <pic:blipFill>
+                    <a:blip r:embed="rId9"/>
+                    <a:stretch>
+                      <a:fillRect/>
+                    </a:stretch>
+                  </pic:blipFill>
+                  <pic:spPr>
+                    <a:xfrm>
+                      <a:off x="0" y="0"/>
+                      <a:ext cx="5943600" cy="1837690"/>
+                    </a:xfrm>
+                    <a:prstGeom prst="rect">
+                      <a:avLst/>
+                    </a:prstGeom>
+                  </pic:spPr>
+                </pic:pic>
+              </a:graphicData>
+            </a:graphic>
+          </wp:inline>
+        </w:drawing>
+      </w:r>
+    </w:p>
+    <w:p>
+      <w:pPr>
+        <w:pStyle w:val="ListParagraph"/>
+        <w:numPr>
+          <w:ilvl w:val="0"/>
+          <w:numId w:val="1"/>
+        </w:numPr>
+      </w:pPr>
+      <w:r>
         <w:t>challenge6_pattern_matcher.py</w:t>
+      </w:r>
+    </w:p>
+    <w:p>
+      <w:pPr>
+        <w:pStyle w:val="ListParagraph"/>
+      </w:pPr>
+      <w:r>
+        <w:t>Output:</w:t>
+      </w:r>
+    </w:p>
+    <w:p>
+      <w:pPr>
+        <w:pStyle w:val="ListParagraph"/>
+      </w:pPr>
+      <w:r>
+        <w:drawing>
+          <wp:inline distT="0" distB="0" distL="0" distR="0" wp14:anchorId="7ABC329D" wp14:editId="1D93258E">
+            <wp:extent cx="5943600" cy="2208530"/>
+            <wp:effectExtent l="0" t="0" r="0" b="1270"/>
+            <wp:docPr id="1458748160" name="Picture 1"/>
+            <wp:cNvGraphicFramePr>
+              <a:graphicFrameLocks xmlns:a="http://schemas.openxmlformats.org/drawingml/2006/main" noChangeAspect="1"/>
+            </wp:cNvGraphicFramePr>
+            <a:graphic xmlns:a="http://schemas.openxmlformats.org/drawingml/2006/main">
+              <a:graphicData uri="http://schemas.openxmlformats.org/drawingml/2006/picture">
+                <pic:pic xmlns:pic="http://schemas.openxmlformats.org/drawingml/2006/picture">
+                  <pic:nvPicPr>
+                    <pic:cNvPr id="1458748160" name=""/>
+                    <pic:cNvPicPr/>
+                  </pic:nvPicPr>
+                  <pic:blipFill>
+                    <a:blip r:embed="rId10"/>
+                    <a:stretch>
+                      <a:fillRect/>
+                    </a:stretch>
+                  </pic:blipFill>
+                  <pic:spPr>
+                    <a:xfrm>
+                      <a:off x="0" y="0"/>
+                      <a:ext cx="5943600" cy="2208530"/>
+                    </a:xfrm>
+                    <a:prstGeom prst="rect">
+                      <a:avLst/>
+                    </a:prstGeom>
+                  </pic:spPr>
+                </pic:pic>
+              </a:graphicData>
+            </a:graphic>
+          </wp:inline>
+        </w:drawing>
       </w:r>
     </w:p>
     <w:sectPr>

</xml_diff>